<commit_message>
Working on the newest bibr format
</commit_message>
<xml_diff>
--- a/data-raw/demo/to_err_is_human.docx
+++ b/data-raw/demo/to_err_is_human.docx
@@ -7,15 +7,31 @@
         <w:pStyle w:val="Title"/>
       </w:pPr>
       <w:r>
-        <w:t xml:space="preserve">To Err is Human</w:t>
-      </w:r>
-    </w:p>
-    <w:p>
-      <w:pPr>
-        <w:pStyle w:val="Subtitle"/>
-      </w:pPr>
-      <w:r>
-        <w:t xml:space="preserve">An Empirical Investigation</w:t>
+        <w:t xml:space="preserve">To Err is Human: An Empirical Investigation</w:t>
+      </w:r>
+    </w:p>
+    <w:p>
+      <w:pPr>
+        <w:pStyle w:val="Author"/>
+      </w:pPr>
+      <w:r>
+        <w:t xml:space="preserve">Daniel Lakens</w:t>
+      </w:r>
+    </w:p>
+    <w:p>
+      <w:pPr>
+        <w:pStyle w:val="Author"/>
+      </w:pPr>
+      <w:r>
+        <w:t xml:space="preserve">Lisa DeBruine</w:t>
+      </w:r>
+    </w:p>
+    <w:p>
+      <w:pPr>
+        <w:pStyle w:val="Author"/>
+      </w:pPr>
+      <w:r>
+        <w:t xml:space="preserve">Jakub Werner</w:t>
       </w:r>
     </w:p>
     <w:p>
@@ -54,13 +70,30 @@
         <w:t xml:space="preserve">to describe non-significant findings; (7) a power analysis reporting some of the essential attributes; and (8) retrieving information from preregistrations.</w:t>
       </w:r>
     </w:p>
-    <w:bookmarkStart w:id="20" w:name="introduction"/>
+    <w:p>
+      <w:pPr>
+        <w:pStyle w:val="FirstParagraph"/>
+      </w:pPr>
+      <w:r>
+        <w:t xml:space="preserve">Although intentional dishonesty might be a successful way to boost creativity</w:t>
+      </w:r>
+      <w:r>
+        <w:t xml:space="preserve"> </w:t>
+      </w:r>
+      <w:r>
+        <w:t xml:space="preserve">(Gino and Wiltermuth 2014)</w:t>
+      </w:r>
+      <w:r>
+        <w:t xml:space="preserve">, it is safe to say most mistakes researchers make are unintentional. From a human factors perspective, human error is a symptom of a poor design (Smithy, 2020). Automation can be used to check for errors in scientific manuscripts, and inform authors about possible corrections. In this study we examine the usefulness of metacheck to improve best practices.</w:t>
+      </w:r>
+    </w:p>
+    <w:bookmarkStart w:id="25" w:name="method"/>
     <w:p>
       <w:pPr>
         <w:pStyle w:val="Heading2"/>
       </w:pPr>
       <w:r>
-        <w:t xml:space="preserve">Introduction</w:t>
+        <w:t xml:space="preserve">Method</w:t>
       </w:r>
     </w:p>
     <w:p>
@@ -68,26 +101,95 @@
         <w:pStyle w:val="FirstParagraph"/>
       </w:pPr>
       <w:r>
-        <w:t xml:space="preserve">Although intentional dishonesty might be a successful way to boost creativity</w:t>
-      </w:r>
-      <w:r>
-        <w:t xml:space="preserve"> </w:t>
-      </w:r>
-      <w:r>
-        <w:t xml:space="preserve">(Gino and Wiltermuth 2014)</w:t>
-      </w:r>
-      <w:r>
-        <w:t xml:space="preserve">, it is safe to say most mistakes researchers make are unintentional. From a human factors perspective, human error is a symptom of a poor design (Smithy, 2020). Automation can be used to check for errors in scientific manuscripts, and inform authors about possible corrections. In this study we examine the usefulness of metacheck to improve best practices.</w:t>
-      </w:r>
-    </w:p>
-    <w:bookmarkEnd w:id="20"/>
-    <w:bookmarkStart w:id="21" w:name="method"/>
+        <w:t xml:space="preserve">In this study</w:t>
+      </w:r>
+      <w:r>
+        <w:rPr>
+          <w:rStyle w:val="FootnoteReference"/>
+        </w:rPr>
+        <w:footnoteReference w:id="20"/>
+      </w:r>
+      <w:r>
+        <w:t xml:space="preserve"> </w:t>
+      </w:r>
+      <w:r>
+        <w:t xml:space="preserve">we examine whether automated checks reduce the amount of errors that researchers make in scientific manuscripts. This study was preregistered at https://osf.io/48ncu and on AsPredicted at https://aspredicted.org/by8i8v.pdf.</w:t>
+      </w:r>
+    </w:p>
+    <w:bookmarkStart w:id="21" w:name="procedure"/>
+    <w:p>
+      <w:pPr>
+        <w:pStyle w:val="Heading3"/>
+      </w:pPr>
+      <w:r>
+        <w:t xml:space="preserve">Procedure</w:t>
+      </w:r>
+    </w:p>
+    <w:p>
+      <w:pPr>
+        <w:pStyle w:val="FirstParagraph"/>
+      </w:pPr>
+      <w:r>
+        <w:t xml:space="preserve">We randomly assigned 50 scientists to a condition where their manuscript was automatically checked for errors, and 50 scientists to a control condition with a checklist. Scientists had the opportunity to make changes to their manuscript based on the feedback of the tool. We subsequently coded all manuscripts for mistakes, and counted the total number of mistakes. We also measured the expertise of researchers (in years) to explore whether the automated tool would be more useful, the less research experience researchers had. We also asked researchers to rate how useful they found the checklist or app on a scale from 1 (not at all) to 7 (extremely useful).</w:t>
+      </w:r>
+    </w:p>
+    <w:bookmarkEnd w:id="21"/>
+    <w:bookmarkStart w:id="22" w:name="data-availability"/>
+    <w:p>
+      <w:pPr>
+        <w:pStyle w:val="Heading3"/>
+      </w:pPr>
+      <w:r>
+        <w:t xml:space="preserve">Data Availability</w:t>
+      </w:r>
+    </w:p>
+    <w:p>
+      <w:pPr>
+        <w:pStyle w:val="FirstParagraph"/>
+      </w:pPr>
+      <w:r>
+        <w:t xml:space="preserve">Data and analysis code is available on GitHub from https://github.com/Lakens/to_err_is_human and from https://researchbox.org/4377. Data is also available from https://osf.io/5tbm9 and code is also available from https://osf.io/629bx.</w:t>
+      </w:r>
+    </w:p>
+    <w:bookmarkEnd w:id="22"/>
+    <w:bookmarkStart w:id="24" w:name="power-analysis"/>
+    <w:p>
+      <w:pPr>
+        <w:pStyle w:val="Heading3"/>
+      </w:pPr>
+      <w:r>
+        <w:t xml:space="preserve">Power Analysis</w:t>
+      </w:r>
+    </w:p>
+    <w:p>
+      <w:pPr>
+        <w:pStyle w:val="FirstParagraph"/>
+      </w:pPr>
+      <w:r>
+        <w:t xml:space="preserve">We conducted a sensitivity power analysis</w:t>
+      </w:r>
+      <w:r>
+        <w:rPr>
+          <w:rStyle w:val="FootnoteReference"/>
+        </w:rPr>
+        <w:footnoteReference w:id="23"/>
+      </w:r>
+      <w:r>
+        <w:t xml:space="preserve"> </w:t>
+      </w:r>
+      <w:r>
+        <w:t xml:space="preserve">to determine that a Cohen’s d of 0.50 is the smallest effect size that we could detect with N = 50 participants in each group and 80% power.</w:t>
+      </w:r>
+    </w:p>
+    <w:bookmarkEnd w:id="24"/>
+    <w:bookmarkEnd w:id="25"/>
+    <w:bookmarkStart w:id="35" w:name="results"/>
     <w:p>
       <w:pPr>
         <w:pStyle w:val="Heading2"/>
       </w:pPr>
       <w:r>
-        <w:t xml:space="preserve">Method</w:t>
+        <w:t xml:space="preserve">Results</w:t>
       </w:r>
     </w:p>
     <w:p>
@@ -95,78 +197,6 @@
         <w:pStyle w:val="FirstParagraph"/>
       </w:pPr>
       <w:r>
-        <w:t xml:space="preserve">In this study we examine whether automated checks reduce the amount of errors that researchers make in scientific manuscripts. This study was preregistered at https://osf.io/48ncu and on AsPredicted at https://aspredicted.org/by8i8v.pdf.</w:t>
-      </w:r>
-    </w:p>
-    <w:bookmarkEnd w:id="21"/>
-    <w:bookmarkStart w:id="22" w:name="procedure"/>
-    <w:p>
-      <w:pPr>
-        <w:pStyle w:val="Heading2"/>
-      </w:pPr>
-      <w:r>
-        <w:t xml:space="preserve">Procedure</w:t>
-      </w:r>
-    </w:p>
-    <w:p>
-      <w:pPr>
-        <w:pStyle w:val="FirstParagraph"/>
-      </w:pPr>
-      <w:r>
-        <w:t xml:space="preserve">We randomly assigned 50 scientists to a condition where their manuscript was automatically checked for errors, and 50 scientists to a control condition with a checklist. Scientists had the opportunity to make changes to their manuscript based on the feedback of the tool. We subsequently coded all manuscripts for mistakes, and counted the total number of mistakes. We also measured the expertise of researchers (in years) to explore whether the automated tool would be more useful, the less research experience researchers had. We also asked researchers to rate how useful they found the checklist or app on a scale from 1 (not at all) to 7 (extremely useful).</w:t>
-      </w:r>
-    </w:p>
-    <w:bookmarkEnd w:id="22"/>
-    <w:bookmarkStart w:id="23" w:name="data-availability"/>
-    <w:p>
-      <w:pPr>
-        <w:pStyle w:val="Heading2"/>
-      </w:pPr>
-      <w:r>
-        <w:t xml:space="preserve">Data Availability</w:t>
-      </w:r>
-    </w:p>
-    <w:p>
-      <w:pPr>
-        <w:pStyle w:val="FirstParagraph"/>
-      </w:pPr>
-      <w:r>
-        <w:t xml:space="preserve">Data and analysis code is available on GitHub from https://github.com/Lakens/to_err_is_human and from https://researchbox.org/4377. Data is also available from https://osf.io/5tbm9 and code is also available from https://osf.io/629bx.</w:t>
-      </w:r>
-    </w:p>
-    <w:bookmarkEnd w:id="23"/>
-    <w:bookmarkStart w:id="24" w:name="power-analysis"/>
-    <w:p>
-      <w:pPr>
-        <w:pStyle w:val="Heading2"/>
-      </w:pPr>
-      <w:r>
-        <w:t xml:space="preserve">Power Analysis</w:t>
-      </w:r>
-    </w:p>
-    <w:p>
-      <w:pPr>
-        <w:pStyle w:val="FirstParagraph"/>
-      </w:pPr>
-      <w:r>
-        <w:t xml:space="preserve">We conducted a sensitivity power analysis to determine that a Cohen’s d of 0.50 is the smallest effect size that we could detect with N = 50 participants in each group and 80% power.</w:t>
-      </w:r>
-    </w:p>
-    <w:bookmarkEnd w:id="24"/>
-    <w:bookmarkStart w:id="34" w:name="results"/>
-    <w:p>
-      <w:pPr>
-        <w:pStyle w:val="Heading2"/>
-      </w:pPr>
-      <w:r>
-        <w:t xml:space="preserve">Results</w:t>
-      </w:r>
-    </w:p>
-    <w:p>
-      <w:pPr>
-        <w:pStyle w:val="FirstParagraph"/>
-      </w:pPr>
-      <w:r>
         <w:t xml:space="preserve">We simulated the data using Faux</w:t>
       </w:r>
       <w:r>
@@ -180,6 +210,20 @@
       </w:r>
       <w:r>
         <w:t xml:space="preserve">(</w:t>
+      </w:r>
+      <w:hyperlink w:anchor="tbl-summary">
+        <w:r>
+          <w:rPr>
+            <w:rStyle w:val="Hyperlink"/>
+          </w:rPr>
+          <w:t xml:space="preserve">Table 1</w:t>
+        </w:r>
+      </w:hyperlink>
+      <w:r>
+        <w:t xml:space="preserve">,</w:t>
+      </w:r>
+      <w:r>
+        <w:t xml:space="preserve"> </w:t>
       </w:r>
       <w:hyperlink w:anchor="fig-sim">
         <w:r>
@@ -206,7 +250,7 @@
       <w:tr>
         <w:tc>
           <w:tcPr/>
-          <w:bookmarkStart w:id="28" w:name="fig-sim"/>
+          <w:bookmarkStart w:id="29" w:name="fig-sim"/>
           <w:p>
             <w:pPr>
               <w:pStyle w:val="Compact"/>
@@ -217,18 +261,18 @@
                 <wp:inline>
                   <wp:extent cx="5334000" cy="4267200"/>
                   <wp:effectExtent b="0" l="0" r="0" t="0"/>
-                  <wp:docPr descr="" title="" id="26" name="Picture"/>
+                  <wp:docPr descr="" title="" id="27" name="Picture"/>
                   <a:graphic>
                     <a:graphicData uri="http://schemas.openxmlformats.org/drawingml/2006/picture">
                       <pic:pic>
                         <pic:nvPicPr>
-                          <pic:cNvPr descr="to_err_is_human_files/figure-docx/fig-sim-1.png" id="27" name="Picture"/>
+                          <pic:cNvPr descr="to_err_is_human_files/figure-docx/fig-sim-1.png" id="28" name="Picture"/>
                           <pic:cNvPicPr>
                             <a:picLocks noChangeArrowheads="1" noChangeAspect="1"/>
                           </pic:cNvPicPr>
                         </pic:nvPicPr>
                         <pic:blipFill>
-                          <a:blip r:embed="rId25"/>
+                          <a:blip r:embed="rId26"/>
                           <a:stretch>
                             <a:fillRect/>
                           </a:stretch>
@@ -265,10 +309,10 @@
               <w:pStyle w:val="ImageCaption"/>
             </w:pPr>
             <w:r>
-              <w:t xml:space="preserve">Figure 1: The simulated data</w:t>
+              <w:t xml:space="preserve">Figure 1: The simulated data.</w:t>
             </w:r>
           </w:p>
-          <w:bookmarkEnd w:id="28"/>
+          <w:bookmarkEnd w:id="29"/>
         </w:tc>
       </w:tr>
     </w:tbl>
@@ -285,7 +329,7 @@
       <w:tr>
         <w:tc>
           <w:tcPr/>
-          <w:bookmarkStart w:id="29" w:name="tbl-summary"/>
+          <w:bookmarkStart w:id="30" w:name="tbl-summary"/>
           <w:p>
             <w:pPr>
               <w:jc w:val="center"/>
@@ -437,7 +481,7 @@
               </w:tc>
             </w:tr>
           </w:tbl>
-          <w:bookmarkEnd w:id="29"/>
+          <w:bookmarkEnd w:id="30"/>
           <w:p/>
         </w:tc>
       </w:tr>
@@ -613,7 +657,7 @@
       <w:tr>
         <w:tc>
           <w:tcPr/>
-          <w:bookmarkStart w:id="33" w:name="fig-corr"/>
+          <w:bookmarkStart w:id="34" w:name="fig-corr"/>
           <w:p>
             <w:pPr>
               <w:pStyle w:val="Compact"/>
@@ -624,18 +668,18 @@
                 <wp:inline>
                   <wp:extent cx="5334000" cy="4267200"/>
                   <wp:effectExtent b="0" l="0" r="0" t="0"/>
-                  <wp:docPr descr="" title="" id="31" name="Picture"/>
+                  <wp:docPr descr="" title="" id="32" name="Picture"/>
                   <a:graphic>
                     <a:graphicData uri="http://schemas.openxmlformats.org/drawingml/2006/picture">
                       <pic:pic>
                         <pic:nvPicPr>
-                          <pic:cNvPr descr="to_err_is_human_files/figure-docx/fig-corr-1.png" id="32" name="Picture"/>
+                          <pic:cNvPr descr="to_err_is_human_files/figure-docx/fig-corr-1.png" id="33" name="Picture"/>
                           <pic:cNvPicPr>
                             <a:picLocks noChangeArrowheads="1" noChangeAspect="1"/>
                           </pic:cNvPicPr>
                         </pic:nvPicPr>
                         <pic:blipFill>
-                          <a:blip r:embed="rId30"/>
+                          <a:blip r:embed="rId31"/>
                           <a:stretch>
                             <a:fillRect/>
                           </a:stretch>
@@ -675,12 +719,12 @@
               <w:t xml:space="preserve">Figure 2: The effect of experience on the reduction in errors.</w:t>
             </w:r>
           </w:p>
-          <w:bookmarkEnd w:id="33"/>
+          <w:bookmarkEnd w:id="34"/>
         </w:tc>
       </w:tr>
     </w:tbl>
-    <w:bookmarkEnd w:id="34"/>
-    <w:bookmarkStart w:id="35" w:name="discussion"/>
+    <w:bookmarkEnd w:id="35"/>
+    <w:bookmarkStart w:id="36" w:name="discussion"/>
     <w:p>
       <w:pPr>
         <w:pStyle w:val="Heading2"/>
@@ -694,23 +738,41 @@
         <w:pStyle w:val="FirstParagraph"/>
       </w:pPr>
       <w:r>
-        <w:t xml:space="preserve">It seems automated tools can help prevent errors by providing researchers with feedback about potential mistakes, and researchers feel the app is useful. We conclude the use of automated checks has potential to reduce the number of mistakes in scientific manuscripts.</w:t>
-      </w:r>
-    </w:p>
-    <w:bookmarkEnd w:id="35"/>
-    <w:bookmarkStart w:id="47" w:name="references"/>
+        <w:t xml:space="preserve">Since our data are simulated for demonstration purposes, of course they confirm our hypotheses. It seems automated tools can help prevent errors by providing researchers with feedback about potential mistakes, and researchers feel the app is useful. We conclude the use of automated checks has potential to reduce the number of mistakes in scientific manuscripts.</w:t>
+      </w:r>
+    </w:p>
+    <w:bookmarkEnd w:id="36"/>
+    <w:bookmarkStart w:id="37" w:name="author-notes"/>
     <w:p>
       <w:pPr>
         <w:pStyle w:val="Heading2"/>
       </w:pPr>
       <w:r>
+        <w:t xml:space="preserve">Author Notes</w:t>
+      </w:r>
+    </w:p>
+    <w:p>
+      <w:pPr>
+        <w:pStyle w:val="FirstParagraph"/>
+      </w:pPr>
+      <w:r>
+        <w:t xml:space="preserve">The authors declare a conflict of interest. We really want to see this project succeed and help researchers make their papers better.</w:t>
+      </w:r>
+    </w:p>
+    <w:bookmarkEnd w:id="37"/>
+    <w:bookmarkStart w:id="49" w:name="references"/>
+    <w:p>
+      <w:pPr>
+        <w:pStyle w:val="Heading2"/>
+      </w:pPr>
+      <w:r>
         <w:t xml:space="preserve">References</w:t>
       </w:r>
     </w:p>
-    <w:bookmarkStart w:id="36" w:name="ref"/>
-    <w:bookmarkEnd w:id="36"/>
-    <w:bookmarkStart w:id="46" w:name="refs"/>
-    <w:bookmarkStart w:id="38" w:name="ref-faux"/>
+    <w:bookmarkStart w:id="38" w:name="ref"/>
+    <w:bookmarkEnd w:id="38"/>
+    <w:bookmarkStart w:id="48" w:name="refs"/>
+    <w:bookmarkStart w:id="40" w:name="ref-faux"/>
     <w:p>
       <w:pPr>
         <w:pStyle w:val="Bibliography"/>
@@ -734,7 +796,7 @@
       <w:r>
         <w:t xml:space="preserve"> </w:t>
       </w:r>
-      <w:hyperlink r:id="rId37">
+      <w:hyperlink r:id="rId39">
         <w:r>
           <w:rPr>
             <w:rStyle w:val="Hyperlink"/>
@@ -746,8 +808,8 @@
         <w:t xml:space="preserve">.</w:t>
       </w:r>
     </w:p>
-    <w:bookmarkEnd w:id="38"/>
-    <w:bookmarkStart w:id="40" w:name="ref-EaglyWood1999"/>
+    <w:bookmarkEnd w:id="40"/>
+    <w:bookmarkStart w:id="42" w:name="ref-EaglyWood1999"/>
     <w:p>
       <w:pPr>
         <w:pStyle w:val="Bibliography"/>
@@ -780,7 +842,7 @@
       <w:r>
         <w:t xml:space="preserve"> </w:t>
       </w:r>
-      <w:hyperlink r:id="rId39">
+      <w:hyperlink r:id="rId41">
         <w:r>
           <w:rPr>
             <w:rStyle w:val="Hyperlink"/>
@@ -792,8 +854,8 @@
         <w:t xml:space="preserve">.</w:t>
       </w:r>
     </w:p>
-    <w:bookmarkEnd w:id="40"/>
-    <w:bookmarkStart w:id="42" w:name="ref-GinoWiltermuth2014"/>
+    <w:bookmarkEnd w:id="42"/>
+    <w:bookmarkStart w:id="44" w:name="ref-GinoWiltermuth2014"/>
     <w:p>
       <w:pPr>
         <w:pStyle w:val="Bibliography"/>
@@ -826,7 +888,7 @@
       <w:r>
         <w:t xml:space="preserve"> </w:t>
       </w:r>
-      <w:hyperlink r:id="rId41">
+      <w:hyperlink r:id="rId43">
         <w:r>
           <w:rPr>
             <w:rStyle w:val="Hyperlink"/>
@@ -838,8 +900,8 @@
         <w:t xml:space="preserve">.</w:t>
       </w:r>
     </w:p>
-    <w:bookmarkEnd w:id="42"/>
-    <w:bookmarkStart w:id="43" w:name="ref-Lakens2018"/>
+    <w:bookmarkEnd w:id="44"/>
+    <w:bookmarkStart w:id="45" w:name="ref-Lakens2018"/>
     <w:p>
       <w:pPr>
         <w:pStyle w:val="Bibliography"/>
@@ -870,8 +932,8 @@
         <w:t xml:space="preserve">1: 259–70.</w:t>
       </w:r>
     </w:p>
-    <w:bookmarkEnd w:id="43"/>
-    <w:bookmarkStart w:id="45" w:name="ref-Smith2021"/>
+    <w:bookmarkEnd w:id="45"/>
+    <w:bookmarkStart w:id="47" w:name="ref-Smith2021"/>
     <w:p>
       <w:pPr>
         <w:pStyle w:val="Bibliography"/>
@@ -901,7 +963,7 @@
       <w:r>
         <w:t xml:space="preserve"> </w:t>
       </w:r>
-      <w:hyperlink r:id="rId44">
+      <w:hyperlink r:id="rId46">
         <w:r>
           <w:rPr>
             <w:rStyle w:val="Hyperlink"/>
@@ -913,9 +975,9 @@
         <w:t xml:space="preserve">.</w:t>
       </w:r>
     </w:p>
-    <w:bookmarkEnd w:id="45"/>
-    <w:bookmarkEnd w:id="46"/>
     <w:bookmarkEnd w:id="47"/>
+    <w:bookmarkEnd w:id="48"/>
+    <w:bookmarkEnd w:id="49"/>
     <w:sectPr>
       <w:footnotePr>
         <w:numRestart w:val="eachSect"/>
@@ -942,6 +1004,55 @@
     <w:p>
       <w:r>
         <w:separator/>
+      </w:r>
+    </w:p>
+  </w:footnote>
+  <w:footnote w:id="20">
+    <w:p>
+      <w:pPr>
+        <w:pStyle w:val="FootnoteText"/>
+      </w:pPr>
+      <w:r>
+        <w:rPr>
+          <w:rStyle w:val="FootnoteReference"/>
+        </w:rPr>
+        <w:footnoteRef/>
+      </w:r>
+      <w:r>
+        <w:t xml:space="preserve"> </w:t>
+      </w:r>
+      <w:r>
+        <w:t xml:space="preserve">Remember, this is a demo and none of this is real.</w:t>
+      </w:r>
+    </w:p>
+  </w:footnote>
+  <w:footnote w:id="23">
+    <w:p>
+      <w:pPr>
+        <w:pStyle w:val="FootnoteText"/>
+      </w:pPr>
+      <w:r>
+        <w:rPr>
+          <w:rStyle w:val="FootnoteReference"/>
+        </w:rPr>
+        <w:footnoteRef/>
+      </w:r>
+      <w:r>
+        <w:t xml:space="preserve"> </w:t>
+      </w:r>
+      <w:r>
+        <w:t xml:space="preserve">The code we used for this analysis is as follows.</w:t>
+      </w:r>
+    </w:p>
+    <w:p>
+      <w:pPr>
+        <w:pStyle w:val="FootnoteText"/>
+      </w:pPr>
+      <w:r>
+        <w:rPr>
+          <w:rStyle w:val="VerbatimChar"/>
+        </w:rPr>
+        <w:t xml:space="preserve">pwr::pwr.t.test(n = 50, power = 0.8, alternative = "greater")</w:t>
       </w:r>
     </w:p>
   </w:footnote>

</xml_diff>